<commit_message>
Convert all .xls/.xlsx forms to .docx in Word folders
Margins: top 2.1, left 3, bottom 2, right 1 cm; page orientation, fonts and
tables preserved; headers/footers omitted.

Co-Authored-By: Claude Sonnet 5.5 <noreply@anthropic.com>
Claude-Session: https://claude.ai/code/session_015Tc2XhUbD4kQ766sH8QQHQ
</commit_message>
<xml_diff>
--- a/График/Word/(4.15) Список работников по видам начисл.docx
+++ b/График/Word/(4.15) Список работников по видам начисл.docx
@@ -147,7 +147,7 @@
     <w:p>
       <w:pPr>
         <w:widowControl w:val="0"/>
-        <w:spacing w:before="0" w:after="0" w:lineRule="atLeast" w:line="315"/>
+        <w:spacing w:before="0" w:after="123" w:lineRule="exact" w:line="192"/>
         <w:ind w:left="1329"/>
       </w:pPr>
       <w:r>
@@ -189,14 +189,13 @@
     <w:p>
       <w:pPr>
         <w:widowControl w:val="0"/>
-        <w:spacing w:before="0" w:after="0" w:lineRule="atLeast" w:line="315"/>
+        <w:spacing w:before="0" w:after="123" w:lineRule="exact" w:line="192"/>
         <w:ind w:left="1253"/>
       </w:pPr>
       <w:r>
         <w:rPr>
           <w:rFonts w:ascii="Times New Roman" w:hAnsi="Times New Roman" w:cs="Times New Roman" w:eastAsia="Times New Roman"/>
           <w:sz w:val="16"/>
-          <w:u w:val="single"/>
         </w:rPr>
         <w:t>(месяц)</w:t>
       </w:r>
@@ -860,7 +859,7 @@
     <w:p>
       <w:pPr>
         <w:widowControl w:val="0"/>
-        <w:spacing w:before="0" w:after="0" w:lineRule="atLeast" w:line="315"/>
+        <w:spacing w:before="0" w:after="123" w:lineRule="exact" w:line="192"/>
         <w:ind w:left="1822"/>
         <w:jc w:val="center"/>
       </w:pPr>
@@ -873,7 +872,6 @@
       </w:r>
     </w:p>
     <w:sectPr>
-      <w:footerReference w:type="default" r:id="rId9"/>
       <w:pgSz w:w="11906" w:h="16838"/>
       <w:pgMar w:top="1191" w:right="567" w:bottom="1134" w:left="1701" w:header="737" w:footer="432" w:gutter="0"/>
       <w:cols w:space="720"/>
@@ -881,56 +879,6 @@
     </w:sectPr>
   </w:body>
 </w:document>
-</file>
-
-<file path=word/footer1.xml><?xml version="1.0" encoding="utf-8"?>
-<w:ftr xmlns:m="http://schemas.openxmlformats.org/officeDocument/2006/math" xmlns:mc="http://schemas.openxmlformats.org/markup-compatibility/2006" xmlns:mo="http://schemas.microsoft.com/office/mac/office/2008/main" xmlns:mv="urn:schemas-microsoft-com:mac:vml" xmlns:o="urn:schemas-microsoft-com:office:office" xmlns:r="http://schemas.openxmlformats.org/officeDocument/2006/relationships" xmlns:v="urn:schemas-microsoft-com:vml" xmlns:w10="urn:schemas-microsoft-com:office:word" xmlns:w14="http://schemas.microsoft.com/office/word/2010/wordml" xmlns:w="http://schemas.openxmlformats.org/wordprocessingml/2006/main" xmlns:wne="http://schemas.microsoft.com/office/word/2006/wordml" xmlns:wp14="http://schemas.microsoft.com/office/word/2010/wordprocessingDrawing" xmlns:wp="http://schemas.openxmlformats.org/drawingml/2006/wordprocessingDrawing" xmlns:wpc="http://schemas.microsoft.com/office/word/2010/wordprocessingCanvas" xmlns:wpg="http://schemas.microsoft.com/office/word/2010/wordprocessingGroup" xmlns:wpi="http://schemas.microsoft.com/office/word/2010/wordprocessingInk" xmlns:wps="http://schemas.microsoft.com/office/word/2010/wordprocessingShape" mc:Ignorable="w14 wp14">
-  <w:p>
-    <w:pPr>
-      <w:widowControl w:val="0"/>
-      <w:tabs>
-        <w:tab w:pos="9638" w:val="right"/>
-      </w:tabs>
-      <w:spacing w:before="0" w:after="0" w:line="240" w:lineRule="auto"/>
-    </w:pPr>
-    <w:r>
-      <w:rPr>
-        <w:rFonts w:ascii="Times New Roman" w:hAnsi="Times New Roman" w:cs="Times New Roman" w:eastAsia="Times New Roman"/>
-        <w:sz w:val="26"/>
-      </w:rPr>
-      <w:t>Положение по бухгалтерскому и налоговому учёту</w:t>
-    </w:r>
-    <w:r>
-      <w:tab/>
-    </w:r>
-  </w:p>
-  <w:p>
-    <w:pPr>
-      <w:widowControl w:val="0"/>
-      <w:tabs>
-        <w:tab w:pos="9638" w:val="right"/>
-      </w:tabs>
-      <w:spacing w:before="0" w:after="0" w:line="240" w:lineRule="auto"/>
-    </w:pPr>
-    <w:r>
-      <w:rPr>
-        <w:rFonts w:ascii="Times New Roman" w:hAnsi="Times New Roman" w:cs="Times New Roman" w:eastAsia="Times New Roman"/>
-        <w:sz w:val="26"/>
-      </w:rPr>
-      <w:t>«Учётная политика ОАО «Мозырский НПЗ»</w:t>
-    </w:r>
-    <w:r>
-      <w:tab/>
-    </w:r>
-    <w:r>
-      <w:rPr>
-        <w:rFonts w:ascii="Times New Roman" w:hAnsi="Times New Roman" w:cs="Times New Roman" w:eastAsia="Times New Roman"/>
-        <w:sz w:val="26"/>
-      </w:rPr>
-      <w:t>стр. _______ из ______</w:t>
-    </w:r>
-  </w:p>
-</w:ftr>
 </file>
 
 <file path=word/numbering.xml><?xml version="1.0" encoding="utf-8"?>

</xml_diff>